<commit_message>
feat: surat tidak mampu, kematian, usaha, belum menikah
</commit_message>
<xml_diff>
--- a/public/templates/01. Surat Pengantar RT RW.docx
+++ b/public/templates/01. Surat Pengantar RT RW.docx
@@ -70,7 +70,23 @@
           <w:sz w:val="24"/>
           <w:szCs w:val="24"/>
         </w:rPr>
-        <w:t xml:space="preserve">Kami yang bertanda tangan di bwah </w:t>
+        <w:t>Kami yang bertanda tangan di b</w:t>
+      </w:r>
+      <w:r>
+        <w:rPr>
+          <w:rFonts w:ascii="Arial" w:hAnsi="Arial" w:cs="Arial"/>
+          <w:sz w:val="24"/>
+          <w:szCs w:val="24"/>
+        </w:rPr>
+        <w:t>a</w:t>
+      </w:r>
+      <w:r>
+        <w:rPr>
+          <w:rFonts w:ascii="Arial" w:hAnsi="Arial" w:cs="Arial"/>
+          <w:sz w:val="24"/>
+          <w:szCs w:val="24"/>
+        </w:rPr>
+        <w:t xml:space="preserve">wah </w:t>
       </w:r>
       <w:r>
         <w:rPr>
@@ -120,8 +136,6 @@
         </w:rPr>
         <w:t>}</w:t>
       </w:r>
-      <w:bookmarkStart w:id="1" w:name="_GoBack"/>
-      <w:bookmarkEnd w:id="1"/>
       <w:r>
         <w:rPr>
           <w:rFonts w:ascii="Arial" w:hAnsi="Arial" w:cs="Arial"/>
@@ -365,7 +379,15 @@
           <w:sz w:val="24"/>
           <w:szCs w:val="24"/>
         </w:rPr>
-        <w:t>: ${tempat_lahir}, ${tanggal_lahir}</w:t>
+        <w:t>: ${</w:t>
+      </w:r>
+      <w:r>
+        <w:rPr>
+          <w:rFonts w:ascii="Arial" w:hAnsi="Arial" w:cs="Arial"/>
+          <w:sz w:val="24"/>
+          <w:szCs w:val="24"/>
+        </w:rPr>
+        <w:t>ttl}</w:t>
       </w:r>
     </w:p>
     <w:p>
@@ -561,7 +583,25 @@
                 <w:sz w:val="24"/>
                 <w:szCs w:val="24"/>
               </w:rPr>
-              <w:t>Ketua RT {$rt}</w:t>
+              <w:t>Ketua RT $</w:t>
+            </w:r>
+            <w:bookmarkStart w:id="1" w:name="_GoBack"/>
+            <w:bookmarkEnd w:id="1"/>
+            <w:r>
+              <w:rPr>
+                <w:rFonts w:ascii="Arial" w:hAnsi="Arial" w:cs="Arial"/>
+                <w:sz w:val="24"/>
+                <w:szCs w:val="24"/>
+              </w:rPr>
+              <w:t>{</w:t>
+            </w:r>
+            <w:r>
+              <w:rPr>
+                <w:rFonts w:ascii="Arial" w:hAnsi="Arial" w:cs="Arial"/>
+                <w:sz w:val="24"/>
+                <w:szCs w:val="24"/>
+              </w:rPr>
+              <w:t>rt}</w:t>
             </w:r>
             <w:r>
               <w:rPr>

</xml_diff>

<commit_message>
add validation in surat kematian and old attributes in view
</commit_message>
<xml_diff>
--- a/public/templates/01. Surat Pengantar RT RW.docx
+++ b/public/templates/01. Surat Pengantar RT RW.docx
@@ -583,17 +583,7 @@
                 <w:sz w:val="24"/>
                 <w:szCs w:val="24"/>
               </w:rPr>
-              <w:t>Ketua RT $</w:t>
-            </w:r>
-            <w:bookmarkStart w:id="1" w:name="_GoBack"/>
-            <w:bookmarkEnd w:id="1"/>
-            <w:r>
-              <w:rPr>
-                <w:rFonts w:ascii="Arial" w:hAnsi="Arial" w:cs="Arial"/>
-                <w:sz w:val="24"/>
-                <w:szCs w:val="24"/>
-              </w:rPr>
-              <w:t>{</w:t>
+              <w:t>Ketua RT ${</w:t>
             </w:r>
             <w:r>
               <w:rPr>
@@ -1051,66 +1041,16 @@
     </w:p>
     <w:p>
       <w:pPr>
-        <w:rPr>
-          <w:rFonts w:ascii="Arial" w:hAnsi="Arial" w:cs="Arial"/>
-          <w:sz w:val="24"/>
-          <w:szCs w:val="24"/>
-        </w:rPr>
-      </w:pPr>
-    </w:p>
-    <w:p>
-      <w:pPr>
         <w:spacing w:after="0"/>
         <w:rPr>
           <w:rFonts w:ascii="Arial" w:hAnsi="Arial" w:cs="Arial"/>
-          <w:i/>
-          <w:iCs/>
           <w:sz w:val="18"/>
           <w:szCs w:val="18"/>
         </w:rPr>
       </w:pPr>
-      <w:r>
-        <w:rPr>
-          <w:rFonts w:ascii="Arial" w:hAnsi="Arial" w:cs="Arial"/>
-          <w:i/>
-          <w:iCs/>
-          <w:sz w:val="18"/>
-          <w:szCs w:val="18"/>
-        </w:rPr>
-        <w:t>Tembusan :</w:t>
-      </w:r>
-    </w:p>
-    <w:p>
-      <w:pPr>
-        <w:pStyle w:val="ListParagraph"/>
-        <w:numPr>
-          <w:ilvl w:val="0"/>
-          <w:numId w:val="1"/>
-        </w:numPr>
-        <w:spacing w:after="0"/>
-        <w:rPr>
-          <w:rFonts w:ascii="Arial" w:hAnsi="Arial" w:cs="Arial"/>
-          <w:sz w:val="18"/>
-          <w:szCs w:val="18"/>
-        </w:rPr>
-      </w:pPr>
-      <w:r>
-        <w:rPr>
-          <w:rFonts w:ascii="Arial" w:hAnsi="Arial" w:cs="Arial"/>
-          <w:sz w:val="18"/>
-          <w:szCs w:val="18"/>
-        </w:rPr>
-        <w:t xml:space="preserve">Kepala Dusun </w:t>
-      </w:r>
+      <w:bookmarkStart w:id="1" w:name="_GoBack"/>
       <w:bookmarkEnd w:id="0"/>
-      <w:r>
-        <w:rPr>
-          <w:rFonts w:ascii="Arial" w:hAnsi="Arial" w:cs="Arial"/>
-          <w:sz w:val="18"/>
-          <w:szCs w:val="18"/>
-        </w:rPr>
-        <w:t>${dusun}</w:t>
-      </w:r>
+      <w:bookmarkEnd w:id="1"/>
     </w:p>
     <w:sectPr>
       <w:type w:val="continuous"/>

</xml_diff>